<commit_message>
Fabrication and initial process
</commit_message>
<xml_diff>
--- a/Mechanical Details/Fabrication & Integration Process.docx
+++ b/Mechanical Details/Fabrication & Integration Process.docx
@@ -1,274 +1,548 @@
 
 <file path=word/document.xml><?xml version="1.0" encoding="utf-8"?>
-<w:document xmlns:wpc="http://schemas.microsoft.com/office/word/2010/wordprocessingCanvas" xmlns:mc="http://schemas.openxmlformats.org/markup-compatibility/2006" xmlns:o="urn:schemas-microsoft-com:office:office" xmlns:r="http://schemas.openxmlformats.org/officeDocument/2006/relationships" xmlns:m="http://schemas.openxmlformats.org/officeDocument/2006/math" xmlns:v="urn:schemas-microsoft-com:vml" xmlns:wp14="http://schemas.microsoft.com/office/word/2010/wordprocessingDrawing" xmlns:wp="http://schemas.openxmlformats.org/drawingml/2006/wordprocessingDrawing" xmlns:w10="urn:schemas-microsoft-com:office:word" xmlns:w="http://schemas.openxmlformats.org/wordprocessingml/2006/main" xmlns:w14="http://schemas.microsoft.com/office/word/2010/wordml" xmlns:w15="http://schemas.microsoft.com/office/word/2012/wordml" xmlns:wpg="http://schemas.microsoft.com/office/word/2010/wordprocessingGroup" xmlns:wpi="http://schemas.microsoft.com/office/word/2010/wordprocessingInk" xmlns:wne="http://schemas.microsoft.com/office/word/2006/wordml" xmlns:wps="http://schemas.microsoft.com/office/word/2010/wordprocessingShape" xmlns:w16se="http://schemas.microsoft.com/office/word/2015/wordml/symex" xmlns:w16cid="http://schemas.microsoft.com/office/word/2016/wordml/cid" xmlns:w16="http://schemas.microsoft.com/office/word/2018/wordml" xmlns:w16cex="http://schemas.microsoft.com/office/word/2018/wordml/cex" xmlns:w16sdtdh="http://schemas.microsoft.com/office/word/2020/wordml/sdtdatahash" xmlns:w16sdtfl="http://schemas.microsoft.com/office/word/2024/wordml/sdtformatlock" mc:Ignorable="w14 w15 wp14 w16se w16cid w16 w16cex w16sdtdh w16sdtfl">
+<w:document xmlns:wpc="http://schemas.microsoft.com/office/word/2010/wordprocessingCanvas" xmlns:cx="http://schemas.microsoft.com/office/drawing/2014/chartex" xmlns:cx1="http://schemas.microsoft.com/office/drawing/2015/9/8/chartex" xmlns:cx2="http://schemas.microsoft.com/office/drawing/2015/10/21/chartex" xmlns:cx3="http://schemas.microsoft.com/office/drawing/2016/5/9/chartex" xmlns:cx4="http://schemas.microsoft.com/office/drawing/2016/5/10/chartex" xmlns:cx5="http://schemas.microsoft.com/office/drawing/2016/5/11/chartex" xmlns:cx6="http://schemas.microsoft.com/office/drawing/2016/5/12/chartex" xmlns:cx7="http://schemas.microsoft.com/office/drawing/2016/5/13/chartex" xmlns:cx8="http://schemas.microsoft.com/office/drawing/2016/5/14/chartex" xmlns:mc="http://schemas.openxmlformats.org/markup-compatibility/2006" xmlns:aink="http://schemas.microsoft.com/office/drawing/2016/ink" xmlns:am3d="http://schemas.microsoft.com/office/drawing/2017/model3d" xmlns:o="urn:schemas-microsoft-com:office:office" xmlns:oel="http://schemas.microsoft.com/office/2019/extlst" xmlns:r="http://schemas.openxmlformats.org/officeDocument/2006/relationships" xmlns:m="http://schemas.openxmlformats.org/officeDocument/2006/math" xmlns:v="urn:schemas-microsoft-com:vml" xmlns:wp14="http://schemas.microsoft.com/office/word/2010/wordprocessingDrawing" xmlns:wp="http://schemas.openxmlformats.org/drawingml/2006/wordprocessingDrawing" xmlns:w10="urn:schemas-microsoft-com:office:word" xmlns:w="http://schemas.openxmlformats.org/wordprocessingml/2006/main" xmlns:w14="http://schemas.microsoft.com/office/word/2010/wordml" xmlns:w15="http://schemas.microsoft.com/office/word/2012/wordml" xmlns:w16cex="http://schemas.microsoft.com/office/word/2018/wordml/cex" xmlns:w16cid="http://schemas.microsoft.com/office/word/2016/wordml/cid" xmlns:w16="http://schemas.microsoft.com/office/word/2018/wordml" xmlns:w16du="http://schemas.microsoft.com/office/word/2023/wordml/word16du" xmlns:w16sdtdh="http://schemas.microsoft.com/office/word/2020/wordml/sdtdatahash" xmlns:w16sdtfl="http://schemas.microsoft.com/office/word/2024/wordml/sdtformatlock" xmlns:w16se="http://schemas.microsoft.com/office/word/2015/wordml/symex" xmlns:wpg="http://schemas.microsoft.com/office/word/2010/wordprocessingGroup" xmlns:wpi="http://schemas.microsoft.com/office/word/2010/wordprocessingInk" xmlns:wne="http://schemas.microsoft.com/office/word/2006/wordml" xmlns:wps="http://schemas.microsoft.com/office/word/2010/wordprocessingShape" mc:Ignorable="w14 w15 w16se w16cid w16 w16cex w16sdtdh w16sdtfl w16du wp14">
   <w:body>
-    <w:p xmlns:wp14="http://schemas.microsoft.com/office/word/2010/wordml" wp14:paraId="4DDF0B06" wp14:textId="6917903F">
+    <w:p>
       <w:pPr>
         <w:pStyle w:val="Heading1"/>
-        <w:keepNext w:val="1"/>
-        <w:keepLines w:val="1"/>
-        <w:suppressLineNumbers w:val="0"/>
-        <w:bidi w:val="0"/>
-        <w:spacing w:before="322" w:beforeAutospacing="off" w:after="322" w:afterAutospacing="off" w:line="279" w:lineRule="auto"/>
-        <w:ind w:left="0" w:right="0"/>
-        <w:jc w:val="left"/>
-        <w:rPr>
-          <w:rFonts w:ascii="Aptos Display" w:hAnsi="Aptos Display" w:eastAsia="Aptos Display" w:cs="Aptos Display"/>
-          <w:b w:val="0"/>
-          <w:bCs w:val="0"/>
-          <w:i w:val="0"/>
-          <w:iCs w:val="0"/>
-          <w:caps w:val="0"/>
-          <w:smallCaps w:val="0"/>
-          <w:noProof w:val="0"/>
-          <w:color w:val="0F4761" w:themeColor="accent1" w:themeTint="FF" w:themeShade="BF"/>
+        <w:spacing w:before="322" w:after="322"/>
+        <w:rPr>
+          <w:rFonts w:ascii="Aptos Display" w:eastAsia="Aptos Display" w:hAnsi="Aptos Display" w:cs="Aptos Display"/>
           <w:sz w:val="48"/>
           <w:szCs w:val="48"/>
-          <w:lang w:val="en-US"/>
-        </w:rPr>
-      </w:pPr>
-      <w:r>
-        <w:rPr>
-          <w:rFonts w:ascii="Aptos Display" w:hAnsi="Aptos Display" w:eastAsia="Aptos Display" w:cs="Aptos Display"/>
-          <w:b w:val="1"/>
-          <w:bCs w:val="1"/>
-          <w:i w:val="0"/>
-          <w:iCs w:val="0"/>
-          <w:caps w:val="0"/>
-          <w:smallCaps w:val="0"/>
-          <w:noProof w:val="0"/>
-          <w:color w:val="0F4761" w:themeColor="accent1" w:themeTint="FF" w:themeShade="BF"/>
+        </w:rPr>
+      </w:pPr>
+      <w:r>
+        <w:rPr>
+          <w:rFonts w:ascii="Aptos Display" w:eastAsia="Aptos Display" w:hAnsi="Aptos Display" w:cs="Aptos Display"/>
+          <w:b/>
+          <w:bCs/>
           <w:sz w:val="48"/>
           <w:szCs w:val="48"/>
-          <w:lang w:val="en-US"/>
         </w:rPr>
         <w:t>Fabrication and Integration Process</w:t>
       </w:r>
     </w:p>
-    <w:p xmlns:wp14="http://schemas.microsoft.com/office/word/2010/wordml" wp14:paraId="4208E9F8" wp14:textId="735EA11D">
+    <w:p>
       <w:pPr>
         <w:pStyle w:val="Heading3"/>
-        <w:keepNext w:val="1"/>
-        <w:keepLines w:val="1"/>
-        <w:spacing w:before="281" w:beforeAutospacing="off" w:after="281" w:afterAutospacing="off"/>
-        <w:rPr>
-          <w:rFonts w:ascii="Aptos Display" w:hAnsi="Aptos Display" w:eastAsia="Aptos Display" w:cs="Aptos Display"/>
-          <w:b w:val="1"/>
-          <w:bCs w:val="1"/>
-          <w:i w:val="0"/>
-          <w:iCs w:val="0"/>
-          <w:caps w:val="0"/>
-          <w:smallCaps w:val="0"/>
-          <w:noProof w:val="0"/>
-          <w:color w:val="0F4761" w:themeColor="accent1" w:themeTint="FF" w:themeShade="BF"/>
+        <w:spacing w:before="281" w:after="281"/>
+        <w:rPr>
+          <w:rFonts w:ascii="Aptos Display" w:eastAsia="Aptos Display" w:hAnsi="Aptos Display" w:cs="Aptos Display"/>
+          <w:b/>
+          <w:bCs/>
+        </w:rPr>
+      </w:pPr>
+      <w:r>
+        <w:rPr>
+          <w:rFonts w:ascii="Aptos Display" w:eastAsia="Aptos Display" w:hAnsi="Aptos Display" w:cs="Aptos Display"/>
+          <w:b/>
+          <w:bCs/>
+        </w:rPr>
+        <w:t xml:space="preserve">1. Material Choice </w:t>
+      </w:r>
+      <w:r>
+        <w:rPr>
+          <w:rFonts w:ascii="Aptos Display" w:eastAsia="Aptos Display" w:hAnsi="Aptos Display" w:cs="Aptos Display"/>
+          <w:b/>
+          <w:bCs/>
+        </w:rPr>
+        <w:t xml:space="preserve">Justification </w:t>
+      </w:r>
+      <w:r>
+        <w:rPr>
+          <w:rFonts w:ascii="Aptos Display" w:eastAsia="Aptos Display" w:hAnsi="Aptos Display" w:cs="Aptos Display"/>
+          <w:b/>
+          <w:bCs/>
+        </w:rPr>
+        <w:t>:</w:t>
+      </w:r>
+    </w:p>
+    <w:p>
+      <w:pPr>
+        <w:rPr>
+          <w:rFonts w:ascii="Aptos Display" w:eastAsia="Aptos Display" w:hAnsi="Aptos Display" w:cs="Aptos Display"/>
+          <w:i/>
+          <w:iCs/>
+          <w:color w:val="7F7F7F" w:themeColor="text1" w:themeTint="80"/>
+          <w:lang w:val="en-IN"/>
+        </w:rPr>
+      </w:pPr>
+      <w:r>
+        <w:rPr>
+          <w:rFonts w:ascii="Aptos Display" w:eastAsia="Aptos Display" w:hAnsi="Aptos Display" w:cs="Aptos Display"/>
+          <w:i/>
+          <w:iCs/>
+          <w:color w:val="7F7F7F" w:themeColor="text1" w:themeTint="80"/>
+          <w:lang w:val="en-IN"/>
+        </w:rPr>
+        <w:t xml:space="preserve">The mechanical components of the robot were fabricated using </w:t>
+      </w:r>
+      <w:r>
+        <w:rPr>
+          <w:rFonts w:ascii="Aptos Display" w:eastAsia="Aptos Display" w:hAnsi="Aptos Display" w:cs="Aptos Display"/>
+          <w:b/>
+          <w:bCs/>
+          <w:i/>
+          <w:iCs/>
+          <w:color w:val="7F7F7F" w:themeColor="text1" w:themeTint="80"/>
+          <w:lang w:val="en-IN"/>
+        </w:rPr>
+        <w:t>3D printing with PLA material</w:t>
+      </w:r>
+      <w:r>
+        <w:rPr>
+          <w:rFonts w:ascii="Aptos Display" w:eastAsia="Aptos Display" w:hAnsi="Aptos Display" w:cs="Aptos Display"/>
+          <w:i/>
+          <w:iCs/>
+          <w:color w:val="7F7F7F" w:themeColor="text1" w:themeTint="80"/>
+          <w:lang w:val="en-IN"/>
+        </w:rPr>
+        <w:t>. PLA was chosen because it is easy to print, widely available, and provides sufficient strength for lightweight robotic applications.</w:t>
+      </w:r>
+    </w:p>
+    <w:p>
+      <w:pPr>
+        <w:rPr>
+          <w:rFonts w:ascii="Aptos Display" w:eastAsia="Aptos Display" w:hAnsi="Aptos Display" w:cs="Aptos Display"/>
+          <w:i/>
+          <w:iCs/>
+          <w:color w:val="7F7F7F" w:themeColor="text1" w:themeTint="80"/>
+          <w:lang w:val="en-IN"/>
+        </w:rPr>
+      </w:pPr>
+      <w:r>
+        <w:rPr>
+          <w:rFonts w:ascii="Aptos Display" w:eastAsia="Aptos Display" w:hAnsi="Aptos Display" w:cs="Aptos Display"/>
+          <w:i/>
+          <w:iCs/>
+          <w:color w:val="7F7F7F" w:themeColor="text1" w:themeTint="80"/>
+          <w:lang w:val="en-IN"/>
+        </w:rPr>
+        <w:t>Compared to materials like resin or acrylic, PLA is more suitable for rapid prototyping and allows quick iteration of parts if modifications are required. It also offers good dimensional accuracy, which is important for fitting servo motors and assembling joints.</w:t>
+      </w:r>
+    </w:p>
+    <w:p>
+      <w:pPr>
+        <w:rPr>
+          <w:rFonts w:ascii="Aptos Display" w:eastAsia="Aptos Display" w:hAnsi="Aptos Display" w:cs="Aptos Display"/>
+          <w:i/>
+          <w:iCs/>
+          <w:color w:val="7F7F7F" w:themeColor="text1" w:themeTint="80"/>
+          <w:lang w:val="en-IN"/>
+        </w:rPr>
+      </w:pPr>
+      <w:r>
+        <w:rPr>
+          <w:rFonts w:ascii="Aptos Display" w:eastAsia="Aptos Display" w:hAnsi="Aptos Display" w:cs="Aptos Display"/>
+          <w:i/>
+          <w:iCs/>
+          <w:color w:val="7F7F7F" w:themeColor="text1" w:themeTint="80"/>
+          <w:lang w:val="en-IN"/>
+        </w:rPr>
+        <w:t>Since the robot is not subjected to heavy loads, PLA provides an optimal balance between strength, weight, and ease of fabrication.</w:t>
+      </w:r>
+    </w:p>
+    <w:p>
+      <w:pPr>
+        <w:rPr>
+          <w:rFonts w:ascii="Aptos Display" w:eastAsia="Aptos Display" w:hAnsi="Aptos Display" w:cs="Aptos Display"/>
+          <w:i/>
+          <w:iCs/>
+          <w:color w:val="7F7F7F" w:themeColor="text1" w:themeTint="80"/>
+          <w:lang w:val="en-IN"/>
+        </w:rPr>
+      </w:pPr>
+    </w:p>
+    <w:p>
+      <w:pPr>
+        <w:rPr>
+          <w:rFonts w:ascii="Aptos Display" w:eastAsia="Aptos Display" w:hAnsi="Aptos Display" w:cs="Aptos Display"/>
+          <w:b/>
+          <w:bCs/>
+          <w:color w:val="0F4761" w:themeColor="accent1" w:themeShade="BF"/>
           <w:sz w:val="28"/>
           <w:szCs w:val="28"/>
-          <w:lang w:val="en-US"/>
-        </w:rPr>
-      </w:pPr>
-      <w:r>
-        <w:rPr>
-          <w:rFonts w:ascii="Aptos Display" w:hAnsi="Aptos Display" w:eastAsia="Aptos Display" w:cs="Aptos Display"/>
-          <w:b w:val="1"/>
-          <w:bCs w:val="1"/>
-          <w:i w:val="0"/>
-          <w:iCs w:val="0"/>
-          <w:caps w:val="0"/>
-          <w:smallCaps w:val="0"/>
-          <w:noProof w:val="0"/>
-          <w:color w:val="0F4761" w:themeColor="accent1" w:themeTint="FF" w:themeShade="BF"/>
+        </w:rPr>
+      </w:pPr>
+      <w:r>
+        <w:rPr>
+          <w:rFonts w:ascii="Aptos Display" w:eastAsia="Aptos Display" w:hAnsi="Aptos Display" w:cs="Aptos Display"/>
+          <w:b/>
+          <w:bCs/>
+          <w:color w:val="0F4761" w:themeColor="accent1" w:themeShade="BF"/>
           <w:sz w:val="28"/>
           <w:szCs w:val="28"/>
-          <w:lang w:val="en-US"/>
-        </w:rPr>
-        <w:t xml:space="preserve">1. Material Choice </w:t>
-      </w:r>
-      <w:r>
-        <w:rPr>
-          <w:rFonts w:ascii="Aptos Display" w:hAnsi="Aptos Display" w:eastAsia="Aptos Display" w:cs="Aptos Display"/>
-          <w:b w:val="1"/>
-          <w:bCs w:val="1"/>
-          <w:i w:val="0"/>
-          <w:iCs w:val="0"/>
-          <w:caps w:val="0"/>
-          <w:smallCaps w:val="0"/>
-          <w:noProof w:val="0"/>
-          <w:color w:val="0F4761" w:themeColor="accent1" w:themeTint="FF" w:themeShade="BF"/>
+        </w:rPr>
+        <w:t xml:space="preserve">2. </w:t>
+      </w:r>
+      <w:r>
+        <w:rPr>
+          <w:rFonts w:ascii="Aptos Display" w:eastAsia="Aptos Display" w:hAnsi="Aptos Display" w:cs="Aptos Display"/>
+          <w:b/>
+          <w:bCs/>
+          <w:color w:val="0F4761" w:themeColor="accent1" w:themeShade="BF"/>
           <w:sz w:val="28"/>
           <w:szCs w:val="28"/>
-          <w:lang w:val="en-US"/>
-        </w:rPr>
-        <w:t xml:space="preserve">Justification </w:t>
-      </w:r>
-      <w:r>
-        <w:rPr>
-          <w:rFonts w:ascii="Aptos Display" w:hAnsi="Aptos Display" w:eastAsia="Aptos Display" w:cs="Aptos Display"/>
-          <w:b w:val="1"/>
-          <w:bCs w:val="1"/>
-          <w:i w:val="0"/>
-          <w:iCs w:val="0"/>
-          <w:caps w:val="0"/>
-          <w:smallCaps w:val="0"/>
-          <w:noProof w:val="0"/>
-          <w:color w:val="0F4761" w:themeColor="accent1" w:themeTint="FF" w:themeShade="BF"/>
-          <w:sz w:val="28"/>
-          <w:szCs w:val="28"/>
-          <w:lang w:val="en-US"/>
-        </w:rPr>
-        <w:t>:</w:t>
-      </w:r>
-    </w:p>
-    <w:p xmlns:wp14="http://schemas.microsoft.com/office/word/2010/wordml" wp14:paraId="7987FCFA" wp14:textId="12340D6D">
-      <w:pPr>
-        <w:pStyle w:val="Normal"/>
-        <w:spacing w:before="240" w:beforeAutospacing="off" w:after="240" w:afterAutospacing="off"/>
-        <w:rPr>
-          <w:rFonts w:ascii="Aptos Display" w:hAnsi="Aptos Display" w:eastAsia="Aptos Display" w:cs="Aptos Display"/>
-          <w:b w:val="0"/>
-          <w:bCs w:val="0"/>
-          <w:i w:val="1"/>
-          <w:iCs w:val="1"/>
-          <w:caps w:val="0"/>
-          <w:smallCaps w:val="0"/>
-          <w:noProof w:val="0"/>
-          <w:color w:val="7F7F7F" w:themeColor="text1" w:themeTint="80" w:themeShade="FF"/>
-          <w:sz w:val="24"/>
-          <w:szCs w:val="24"/>
-          <w:lang w:val="en-US"/>
-        </w:rPr>
-      </w:pPr>
-      <w:r>
-        <w:rPr>
-          <w:rFonts w:ascii="Aptos Display" w:hAnsi="Aptos Display" w:eastAsia="Aptos Display" w:cs="Aptos Display"/>
-          <w:b w:val="0"/>
-          <w:bCs w:val="0"/>
-          <w:i w:val="1"/>
-          <w:iCs w:val="1"/>
-          <w:caps w:val="0"/>
-          <w:smallCaps w:val="0"/>
-          <w:noProof w:val="0"/>
-          <w:color w:val="7F7F7F" w:themeColor="text1" w:themeTint="80" w:themeShade="FF"/>
-          <w:sz w:val="24"/>
-          <w:szCs w:val="24"/>
-          <w:lang w:val="en-US"/>
-        </w:rPr>
-        <w:t>Why</w:t>
-      </w:r>
-      <w:r>
-        <w:rPr>
-          <w:rFonts w:ascii="Aptos Display" w:hAnsi="Aptos Display" w:eastAsia="Aptos Display" w:cs="Aptos Display"/>
-          <w:i w:val="1"/>
-          <w:iCs w:val="1"/>
-          <w:noProof w:val="0"/>
-          <w:color w:val="7F7F7F" w:themeColor="text1" w:themeTint="80" w:themeShade="FF"/>
-          <w:sz w:val="24"/>
-          <w:szCs w:val="24"/>
-          <w:lang w:val="en-US"/>
-        </w:rPr>
-        <w:t xml:space="preserve"> choose Acrylic over MDF? Why PLA instead of Resin? (e.g., weight, durability, aesthetic)</w:t>
-      </w:r>
-    </w:p>
-    <w:p xmlns:wp14="http://schemas.microsoft.com/office/word/2010/wordml" wp14:paraId="3DD96A7D" wp14:textId="5705C22E">
-      <w:pPr>
-        <w:rPr>
-          <w:rFonts w:ascii="Aptos Display" w:hAnsi="Aptos Display" w:eastAsia="Aptos Display" w:cs="Aptos Display"/>
-          <w:b w:val="0"/>
-          <w:bCs w:val="0"/>
-          <w:i w:val="1"/>
-          <w:iCs w:val="1"/>
-          <w:caps w:val="0"/>
-          <w:smallCaps w:val="0"/>
-          <w:noProof w:val="0"/>
-          <w:color w:val="7F7F7F" w:themeColor="text1" w:themeTint="80" w:themeShade="FF"/>
-          <w:sz w:val="24"/>
-          <w:szCs w:val="24"/>
-          <w:lang w:val="en-US"/>
-        </w:rPr>
-      </w:pPr>
-    </w:p>
-    <w:p xmlns:wp14="http://schemas.microsoft.com/office/word/2010/wordml" wp14:paraId="2C078E63" wp14:textId="0A88DB5E">
-      <w:pPr>
-        <w:pStyle w:val="Normal"/>
-        <w:rPr>
-          <w:rFonts w:ascii="Aptos Display" w:hAnsi="Aptos Display" w:eastAsia="Aptos Display" w:cs="Aptos Display"/>
-          <w:b w:val="1"/>
-          <w:bCs w:val="1"/>
-          <w:i w:val="0"/>
-          <w:iCs w:val="0"/>
-          <w:caps w:val="0"/>
-          <w:smallCaps w:val="0"/>
-          <w:noProof w:val="0"/>
-          <w:color w:val="0F4761" w:themeColor="accent1" w:themeTint="FF" w:themeShade="BF"/>
-          <w:sz w:val="28"/>
-          <w:szCs w:val="28"/>
-          <w:lang w:val="en-US"/>
-        </w:rPr>
-      </w:pPr>
-      <w:r>
-        <w:rPr>
-          <w:rFonts w:ascii="Aptos Display" w:hAnsi="Aptos Display" w:eastAsia="Aptos Display" w:cs="Aptos Display"/>
-          <w:b w:val="1"/>
-          <w:bCs w:val="1"/>
-          <w:i w:val="0"/>
-          <w:iCs w:val="0"/>
-          <w:caps w:val="0"/>
-          <w:smallCaps w:val="0"/>
-          <w:noProof w:val="0"/>
-          <w:color w:val="0F4761" w:themeColor="accent1" w:themeTint="FF" w:themeShade="BF"/>
-          <w:sz w:val="28"/>
-          <w:szCs w:val="28"/>
-          <w:lang w:val="en-US"/>
-        </w:rPr>
-        <w:t xml:space="preserve">2. </w:t>
-      </w:r>
-      <w:r>
-        <w:rPr>
-          <w:rFonts w:ascii="Aptos Display" w:hAnsi="Aptos Display" w:eastAsia="Aptos Display" w:cs="Aptos Display"/>
-          <w:b w:val="1"/>
-          <w:bCs w:val="1"/>
-          <w:i w:val="0"/>
-          <w:iCs w:val="0"/>
-          <w:caps w:val="0"/>
-          <w:smallCaps w:val="0"/>
-          <w:noProof w:val="0"/>
-          <w:color w:val="0F4761" w:themeColor="accent1" w:themeTint="FF" w:themeShade="BF"/>
-          <w:sz w:val="28"/>
-          <w:szCs w:val="28"/>
-          <w:lang w:val="en-US"/>
         </w:rPr>
         <w:t>Fabrication Steps :</w:t>
       </w:r>
     </w:p>
     <w:p>
       <w:pPr>
-        <w:pStyle w:val="Normal"/>
-        <w:rPr>
-          <w:rFonts w:ascii="Aptos Display" w:hAnsi="Aptos Display" w:eastAsia="Aptos Display" w:cs="Aptos Display"/>
-          <w:i w:val="1"/>
-          <w:iCs w:val="1"/>
-          <w:noProof w:val="0"/>
-          <w:color w:val="000000" w:themeColor="text1" w:themeTint="FF" w:themeShade="FF"/>
-          <w:sz w:val="24"/>
-          <w:szCs w:val="24"/>
-          <w:lang w:val="en-US"/>
-        </w:rPr>
-      </w:pPr>
-      <w:r>
-        <w:rPr>
-          <w:rFonts w:ascii="Aptos Display" w:hAnsi="Aptos Display" w:eastAsia="Aptos Display" w:cs="Aptos Display"/>
-          <w:i w:val="1"/>
-          <w:iCs w:val="1"/>
-          <w:noProof w:val="0"/>
-          <w:color w:val="7F7F7F" w:themeColor="text1" w:themeTint="80" w:themeShade="FF"/>
-          <w:sz w:val="24"/>
-          <w:szCs w:val="24"/>
-          <w:lang w:val="en-US"/>
-        </w:rPr>
-        <w:t>A documented "Build-log" (e.g., "1. Laser cutting frame," "2. Heat-staking threaded inserts").</w:t>
-      </w:r>
+        <w:numPr>
+          <w:ilvl w:val="0"/>
+          <w:numId w:val="1"/>
+        </w:numPr>
+        <w:rPr>
+          <w:rFonts w:ascii="Aptos Display" w:eastAsia="Aptos Display" w:hAnsi="Aptos Display" w:cs="Aptos Display"/>
+          <w:i/>
+          <w:iCs/>
+          <w:color w:val="7F7F7F" w:themeColor="text1" w:themeTint="80"/>
+          <w:lang w:val="en-IN"/>
+        </w:rPr>
+      </w:pPr>
+      <w:r>
+        <w:rPr>
+          <w:rFonts w:ascii="Aptos Display" w:eastAsia="Aptos Display" w:hAnsi="Aptos Display" w:cs="Aptos Display"/>
+          <w:b/>
+          <w:bCs/>
+          <w:i/>
+          <w:iCs/>
+          <w:color w:val="7F7F7F" w:themeColor="text1" w:themeTint="80"/>
+          <w:lang w:val="en-IN"/>
+        </w:rPr>
+        <w:t>Obtaining Design Files</w:t>
+      </w:r>
+      <w:r>
+        <w:rPr>
+          <w:rFonts w:ascii="Aptos Display" w:eastAsia="Aptos Display" w:hAnsi="Aptos Display" w:cs="Aptos Display"/>
+          <w:i/>
+          <w:iCs/>
+          <w:color w:val="7F7F7F" w:themeColor="text1" w:themeTint="80"/>
+          <w:lang w:val="en-IN"/>
+        </w:rPr>
+        <w:br/>
+        <w:t xml:space="preserve">The 3D model files for the robot structure were sourced and prepared for printing. </w:t>
+      </w:r>
+    </w:p>
+    <w:p>
+      <w:pPr>
+        <w:numPr>
+          <w:ilvl w:val="0"/>
+          <w:numId w:val="1"/>
+        </w:numPr>
+        <w:rPr>
+          <w:rFonts w:ascii="Aptos Display" w:eastAsia="Aptos Display" w:hAnsi="Aptos Display" w:cs="Aptos Display"/>
+          <w:i/>
+          <w:iCs/>
+          <w:color w:val="7F7F7F" w:themeColor="text1" w:themeTint="80"/>
+          <w:lang w:val="en-IN"/>
+        </w:rPr>
+      </w:pPr>
+      <w:r>
+        <w:rPr>
+          <w:rFonts w:ascii="Aptos Display" w:eastAsia="Aptos Display" w:hAnsi="Aptos Display" w:cs="Aptos Display"/>
+          <w:b/>
+          <w:bCs/>
+          <w:i/>
+          <w:iCs/>
+          <w:color w:val="7F7F7F" w:themeColor="text1" w:themeTint="80"/>
+          <w:lang w:val="en-IN"/>
+        </w:rPr>
+        <w:t>Slicing the Models</w:t>
+      </w:r>
+      <w:r>
+        <w:rPr>
+          <w:rFonts w:ascii="Aptos Display" w:eastAsia="Aptos Display" w:hAnsi="Aptos Display" w:cs="Aptos Display"/>
+          <w:i/>
+          <w:iCs/>
+          <w:color w:val="7F7F7F" w:themeColor="text1" w:themeTint="80"/>
+          <w:lang w:val="en-IN"/>
+        </w:rPr>
+        <w:br/>
+        <w:t xml:space="preserve">The STL files were, where print settings such as layer height, infill, and supports were configured. </w:t>
+      </w:r>
+    </w:p>
+    <w:p>
+      <w:pPr>
+        <w:numPr>
+          <w:ilvl w:val="0"/>
+          <w:numId w:val="1"/>
+        </w:numPr>
+        <w:rPr>
+          <w:rFonts w:ascii="Aptos Display" w:eastAsia="Aptos Display" w:hAnsi="Aptos Display" w:cs="Aptos Display"/>
+          <w:i/>
+          <w:iCs/>
+          <w:color w:val="7F7F7F" w:themeColor="text1" w:themeTint="80"/>
+          <w:lang w:val="en-IN"/>
+        </w:rPr>
+      </w:pPr>
+      <w:r>
+        <w:rPr>
+          <w:rFonts w:ascii="Aptos Display" w:eastAsia="Aptos Display" w:hAnsi="Aptos Display" w:cs="Aptos Display"/>
+          <w:b/>
+          <w:bCs/>
+          <w:i/>
+          <w:iCs/>
+          <w:color w:val="7F7F7F" w:themeColor="text1" w:themeTint="80"/>
+          <w:lang w:val="en-IN"/>
+        </w:rPr>
+        <w:t>3D Printing Components</w:t>
+      </w:r>
+      <w:r>
+        <w:rPr>
+          <w:rFonts w:ascii="Aptos Display" w:eastAsia="Aptos Display" w:hAnsi="Aptos Display" w:cs="Aptos Display"/>
+          <w:i/>
+          <w:iCs/>
+          <w:color w:val="7F7F7F" w:themeColor="text1" w:themeTint="80"/>
+          <w:lang w:val="en-IN"/>
+        </w:rPr>
+        <w:br/>
+        <w:t xml:space="preserve">All parts were printed using PLA material, ensuring proper orientation and strength. </w:t>
+      </w:r>
+    </w:p>
+    <w:p>
+      <w:pPr>
+        <w:numPr>
+          <w:ilvl w:val="0"/>
+          <w:numId w:val="1"/>
+        </w:numPr>
+        <w:rPr>
+          <w:rFonts w:ascii="Aptos Display" w:eastAsia="Aptos Display" w:hAnsi="Aptos Display" w:cs="Aptos Display"/>
+          <w:i/>
+          <w:iCs/>
+          <w:color w:val="7F7F7F" w:themeColor="text1" w:themeTint="80"/>
+          <w:lang w:val="en-IN"/>
+        </w:rPr>
+      </w:pPr>
+      <w:r>
+        <w:rPr>
+          <w:rFonts w:ascii="Aptos Display" w:eastAsia="Aptos Display" w:hAnsi="Aptos Display" w:cs="Aptos Display"/>
+          <w:b/>
+          <w:bCs/>
+          <w:i/>
+          <w:iCs/>
+          <w:color w:val="7F7F7F" w:themeColor="text1" w:themeTint="80"/>
+          <w:lang w:val="en-IN"/>
+        </w:rPr>
+        <w:t>Post-Processing</w:t>
+      </w:r>
+      <w:r>
+        <w:rPr>
+          <w:rFonts w:ascii="Aptos Display" w:eastAsia="Aptos Display" w:hAnsi="Aptos Display" w:cs="Aptos Display"/>
+          <w:i/>
+          <w:iCs/>
+          <w:color w:val="7F7F7F" w:themeColor="text1" w:themeTint="80"/>
+          <w:lang w:val="en-IN"/>
+        </w:rPr>
+        <w:br/>
+        <w:t xml:space="preserve">Printed parts were cleaned and checked for defects to ensure proper fitting. </w:t>
+      </w:r>
+    </w:p>
+    <w:p>
+      <w:pPr>
+        <w:numPr>
+          <w:ilvl w:val="0"/>
+          <w:numId w:val="1"/>
+        </w:numPr>
+        <w:rPr>
+          <w:rFonts w:ascii="Aptos Display" w:eastAsia="Aptos Display" w:hAnsi="Aptos Display" w:cs="Aptos Display"/>
+          <w:i/>
+          <w:iCs/>
+          <w:color w:val="7F7F7F" w:themeColor="text1" w:themeTint="80"/>
+          <w:lang w:val="en-IN"/>
+        </w:rPr>
+      </w:pPr>
+      <w:r>
+        <w:rPr>
+          <w:rFonts w:ascii="Aptos Display" w:eastAsia="Aptos Display" w:hAnsi="Aptos Display" w:cs="Aptos Display"/>
+          <w:b/>
+          <w:bCs/>
+          <w:i/>
+          <w:iCs/>
+          <w:color w:val="7F7F7F" w:themeColor="text1" w:themeTint="80"/>
+          <w:lang w:val="en-IN"/>
+        </w:rPr>
+        <w:t>Servo Installation</w:t>
+      </w:r>
+      <w:r>
+        <w:rPr>
+          <w:rFonts w:ascii="Aptos Display" w:eastAsia="Aptos Display" w:hAnsi="Aptos Display" w:cs="Aptos Display"/>
+          <w:i/>
+          <w:iCs/>
+          <w:color w:val="7F7F7F" w:themeColor="text1" w:themeTint="80"/>
+          <w:lang w:val="en-IN"/>
+        </w:rPr>
+        <w:br/>
+        <w:t xml:space="preserve">Servo motors were mounted into the designated slots in each leg and secured properly. </w:t>
+      </w:r>
+    </w:p>
+    <w:p>
+      <w:pPr>
+        <w:numPr>
+          <w:ilvl w:val="0"/>
+          <w:numId w:val="1"/>
+        </w:numPr>
+        <w:rPr>
+          <w:rFonts w:ascii="Aptos Display" w:eastAsia="Aptos Display" w:hAnsi="Aptos Display" w:cs="Aptos Display"/>
+          <w:i/>
+          <w:iCs/>
+          <w:color w:val="7F7F7F" w:themeColor="text1" w:themeTint="80"/>
+          <w:lang w:val="en-IN"/>
+        </w:rPr>
+      </w:pPr>
+      <w:r>
+        <w:rPr>
+          <w:rFonts w:ascii="Aptos Display" w:eastAsia="Aptos Display" w:hAnsi="Aptos Display" w:cs="Aptos Display"/>
+          <w:b/>
+          <w:bCs/>
+          <w:i/>
+          <w:iCs/>
+          <w:color w:val="7F7F7F" w:themeColor="text1" w:themeTint="80"/>
+          <w:lang w:val="en-IN"/>
+        </w:rPr>
+        <w:t>Mechanical Assembly</w:t>
+      </w:r>
+      <w:r>
+        <w:rPr>
+          <w:rFonts w:ascii="Aptos Display" w:eastAsia="Aptos Display" w:hAnsi="Aptos Display" w:cs="Aptos Display"/>
+          <w:i/>
+          <w:iCs/>
+          <w:color w:val="7F7F7F" w:themeColor="text1" w:themeTint="80"/>
+          <w:lang w:val="en-IN"/>
+        </w:rPr>
+        <w:br/>
+        <w:t xml:space="preserve">The legs and body were assembled to form the complete robot structure. </w:t>
+      </w:r>
+    </w:p>
+    <w:p>
+      <w:pPr>
+        <w:numPr>
+          <w:ilvl w:val="0"/>
+          <w:numId w:val="1"/>
+        </w:numPr>
+        <w:rPr>
+          <w:rFonts w:ascii="Aptos Display" w:eastAsia="Aptos Display" w:hAnsi="Aptos Display" w:cs="Aptos Display"/>
+          <w:i/>
+          <w:iCs/>
+          <w:color w:val="7F7F7F" w:themeColor="text1" w:themeTint="80"/>
+          <w:lang w:val="en-IN"/>
+        </w:rPr>
+      </w:pPr>
+      <w:r>
+        <w:rPr>
+          <w:rFonts w:ascii="Aptos Display" w:eastAsia="Aptos Display" w:hAnsi="Aptos Display" w:cs="Aptos Display"/>
+          <w:b/>
+          <w:bCs/>
+          <w:i/>
+          <w:iCs/>
+          <w:color w:val="7F7F7F" w:themeColor="text1" w:themeTint="80"/>
+          <w:lang w:val="en-IN"/>
+        </w:rPr>
+        <w:t>Electronics Integration</w:t>
+      </w:r>
+      <w:r>
+        <w:rPr>
+          <w:rFonts w:ascii="Aptos Display" w:eastAsia="Aptos Display" w:hAnsi="Aptos Display" w:cs="Aptos Display"/>
+          <w:i/>
+          <w:iCs/>
+          <w:color w:val="7F7F7F" w:themeColor="text1" w:themeTint="80"/>
+          <w:lang w:val="en-IN"/>
+        </w:rPr>
+        <w:br/>
+        <w:t xml:space="preserve">ESP32, PCA9685, and other components were mounted onto the body. </w:t>
+      </w:r>
+    </w:p>
+    <w:p>
+      <w:pPr>
+        <w:numPr>
+          <w:ilvl w:val="0"/>
+          <w:numId w:val="1"/>
+        </w:numPr>
+        <w:rPr>
+          <w:rFonts w:ascii="Aptos Display" w:eastAsia="Aptos Display" w:hAnsi="Aptos Display" w:cs="Aptos Display"/>
+          <w:i/>
+          <w:iCs/>
+          <w:color w:val="7F7F7F" w:themeColor="text1" w:themeTint="80"/>
+          <w:lang w:val="en-IN"/>
+        </w:rPr>
+      </w:pPr>
+      <w:r>
+        <w:rPr>
+          <w:rFonts w:ascii="Aptos Display" w:eastAsia="Aptos Display" w:hAnsi="Aptos Display" w:cs="Aptos Display"/>
+          <w:b/>
+          <w:bCs/>
+          <w:i/>
+          <w:iCs/>
+          <w:color w:val="7F7F7F" w:themeColor="text1" w:themeTint="80"/>
+          <w:lang w:val="en-IN"/>
+        </w:rPr>
+        <w:lastRenderedPageBreak/>
+        <w:t>Wiring and Organization</w:t>
+      </w:r>
+      <w:r>
+        <w:rPr>
+          <w:rFonts w:ascii="Aptos Display" w:eastAsia="Aptos Display" w:hAnsi="Aptos Display" w:cs="Aptos Display"/>
+          <w:i/>
+          <w:iCs/>
+          <w:color w:val="7F7F7F" w:themeColor="text1" w:themeTint="80"/>
+          <w:lang w:val="en-IN"/>
+        </w:rPr>
+        <w:br/>
+        <w:t xml:space="preserve">All connections were made and wires were arranged to avoid interference with movement. </w:t>
+      </w:r>
+    </w:p>
+    <w:p>
+      <w:pPr>
+        <w:numPr>
+          <w:ilvl w:val="0"/>
+          <w:numId w:val="1"/>
+        </w:numPr>
+        <w:rPr>
+          <w:rFonts w:ascii="Aptos Display" w:eastAsia="Aptos Display" w:hAnsi="Aptos Display" w:cs="Aptos Display"/>
+          <w:i/>
+          <w:iCs/>
+          <w:color w:val="7F7F7F" w:themeColor="text1" w:themeTint="80"/>
+          <w:lang w:val="en-IN"/>
+        </w:rPr>
+      </w:pPr>
+      <w:r>
+        <w:rPr>
+          <w:rFonts w:ascii="Aptos Display" w:eastAsia="Aptos Display" w:hAnsi="Aptos Display" w:cs="Aptos Display"/>
+          <w:b/>
+          <w:bCs/>
+          <w:i/>
+          <w:iCs/>
+          <w:color w:val="7F7F7F" w:themeColor="text1" w:themeTint="80"/>
+          <w:lang w:val="en-IN"/>
+        </w:rPr>
+        <w:t>Testing and Iteration</w:t>
+      </w:r>
+      <w:r>
+        <w:rPr>
+          <w:rFonts w:ascii="Aptos Display" w:eastAsia="Aptos Display" w:hAnsi="Aptos Display" w:cs="Aptos Display"/>
+          <w:i/>
+          <w:iCs/>
+          <w:color w:val="7F7F7F" w:themeColor="text1" w:themeTint="80"/>
+          <w:lang w:val="en-IN"/>
+        </w:rPr>
+        <w:br/>
+        <w:t xml:space="preserve">Individual components were tested first, followed by full system testing. Minor adjustments were made to improve balance and movement. </w:t>
+      </w:r>
+    </w:p>
+    <w:p>
+      <w:pPr>
+        <w:rPr>
+          <w:rFonts w:ascii="Aptos Display" w:eastAsia="Aptos Display" w:hAnsi="Aptos Display" w:cs="Aptos Display"/>
+          <w:i/>
+          <w:iCs/>
+          <w:color w:val="000000" w:themeColor="text1"/>
+        </w:rPr>
+      </w:pPr>
     </w:p>
     <w:sectPr>
-      <w:pgSz w:w="12240" w:h="15840" w:orient="portrait"/>
+      <w:pgSz w:w="12240" w:h="15840"/>
       <w:pgMar w:top="1440" w:right="1440" w:bottom="1440" w:left="1440" w:header="720" w:footer="720" w:gutter="0"/>
       <w:cols w:space="720"/>
       <w:docGrid w:linePitch="360"/>
@@ -277,12 +551,133 @@
 </w:document>
 </file>
 
+<file path=word/numbering.xml><?xml version="1.0" encoding="utf-8"?>
+<w:numbering xmlns:wpc="http://schemas.microsoft.com/office/word/2010/wordprocessingCanvas" xmlns:cx="http://schemas.microsoft.com/office/drawing/2014/chartex" xmlns:cx1="http://schemas.microsoft.com/office/drawing/2015/9/8/chartex" xmlns:cx2="http://schemas.microsoft.com/office/drawing/2015/10/21/chartex" xmlns:cx3="http://schemas.microsoft.com/office/drawing/2016/5/9/chartex" xmlns:cx4="http://schemas.microsoft.com/office/drawing/2016/5/10/chartex" xmlns:cx5="http://schemas.microsoft.com/office/drawing/2016/5/11/chartex" xmlns:cx6="http://schemas.microsoft.com/office/drawing/2016/5/12/chartex" xmlns:cx7="http://schemas.microsoft.com/office/drawing/2016/5/13/chartex" xmlns:cx8="http://schemas.microsoft.com/office/drawing/2016/5/14/chartex" xmlns:mc="http://schemas.openxmlformats.org/markup-compatibility/2006" xmlns:aink="http://schemas.microsoft.com/office/drawing/2016/ink" xmlns:am3d="http://schemas.microsoft.com/office/drawing/2017/model3d" xmlns:o="urn:schemas-microsoft-com:office:office" xmlns:oel="http://schemas.microsoft.com/office/2019/extlst" xmlns:r="http://schemas.openxmlformats.org/officeDocument/2006/relationships" xmlns:m="http://schemas.openxmlformats.org/officeDocument/2006/math" xmlns:v="urn:schemas-microsoft-com:vml" xmlns:wp14="http://schemas.microsoft.com/office/word/2010/wordprocessingDrawing" xmlns:wp="http://schemas.openxmlformats.org/drawingml/2006/wordprocessingDrawing" xmlns:w10="urn:schemas-microsoft-com:office:word" xmlns:w="http://schemas.openxmlformats.org/wordprocessingml/2006/main" xmlns:w14="http://schemas.microsoft.com/office/word/2010/wordml" xmlns:w15="http://schemas.microsoft.com/office/word/2012/wordml" xmlns:w16cex="http://schemas.microsoft.com/office/word/2018/wordml/cex" xmlns:w16cid="http://schemas.microsoft.com/office/word/2016/wordml/cid" xmlns:w16="http://schemas.microsoft.com/office/word/2018/wordml" xmlns:w16du="http://schemas.microsoft.com/office/word/2023/wordml/word16du" xmlns:w16sdtdh="http://schemas.microsoft.com/office/word/2020/wordml/sdtdatahash" xmlns:w16sdtfl="http://schemas.microsoft.com/office/word/2024/wordml/sdtformatlock" xmlns:w16se="http://schemas.microsoft.com/office/word/2015/wordml/symex" xmlns:wpg="http://schemas.microsoft.com/office/word/2010/wordprocessingGroup" xmlns:wpi="http://schemas.microsoft.com/office/word/2010/wordprocessingInk" xmlns:wne="http://schemas.microsoft.com/office/word/2006/wordml" xmlns:wps="http://schemas.microsoft.com/office/word/2010/wordprocessingShape" mc:Ignorable="w14 w15 w16se w16cid w16 w16cex w16sdtdh w16sdtfl w16du wp14">
+  <w:abstractNum w:abstractNumId="0" w15:restartNumberingAfterBreak="0">
+    <w:nsid w:val="57047905"/>
+    <w:multiLevelType w:val="multilevel"/>
+    <w:tmpl w:val="1934461A"/>
+    <w:lvl w:ilvl="0">
+      <w:start w:val="1"/>
+      <w:numFmt w:val="decimal"/>
+      <w:lvlText w:val="%1."/>
+      <w:lvlJc w:val="left"/>
+      <w:pPr>
+        <w:tabs>
+          <w:tab w:val="num" w:pos="720"/>
+        </w:tabs>
+        <w:ind w:left="720" w:hanging="360"/>
+      </w:pPr>
+    </w:lvl>
+    <w:lvl w:ilvl="1" w:tentative="1">
+      <w:start w:val="1"/>
+      <w:numFmt w:val="decimal"/>
+      <w:lvlText w:val="%2."/>
+      <w:lvlJc w:val="left"/>
+      <w:pPr>
+        <w:tabs>
+          <w:tab w:val="num" w:pos="1440"/>
+        </w:tabs>
+        <w:ind w:left="1440" w:hanging="360"/>
+      </w:pPr>
+    </w:lvl>
+    <w:lvl w:ilvl="2" w:tentative="1">
+      <w:start w:val="1"/>
+      <w:numFmt w:val="decimal"/>
+      <w:lvlText w:val="%3."/>
+      <w:lvlJc w:val="left"/>
+      <w:pPr>
+        <w:tabs>
+          <w:tab w:val="num" w:pos="2160"/>
+        </w:tabs>
+        <w:ind w:left="2160" w:hanging="360"/>
+      </w:pPr>
+    </w:lvl>
+    <w:lvl w:ilvl="3" w:tentative="1">
+      <w:start w:val="1"/>
+      <w:numFmt w:val="decimal"/>
+      <w:lvlText w:val="%4."/>
+      <w:lvlJc w:val="left"/>
+      <w:pPr>
+        <w:tabs>
+          <w:tab w:val="num" w:pos="2880"/>
+        </w:tabs>
+        <w:ind w:left="2880" w:hanging="360"/>
+      </w:pPr>
+    </w:lvl>
+    <w:lvl w:ilvl="4" w:tentative="1">
+      <w:start w:val="1"/>
+      <w:numFmt w:val="decimal"/>
+      <w:lvlText w:val="%5."/>
+      <w:lvlJc w:val="left"/>
+      <w:pPr>
+        <w:tabs>
+          <w:tab w:val="num" w:pos="3600"/>
+        </w:tabs>
+        <w:ind w:left="3600" w:hanging="360"/>
+      </w:pPr>
+    </w:lvl>
+    <w:lvl w:ilvl="5" w:tentative="1">
+      <w:start w:val="1"/>
+      <w:numFmt w:val="decimal"/>
+      <w:lvlText w:val="%6."/>
+      <w:lvlJc w:val="left"/>
+      <w:pPr>
+        <w:tabs>
+          <w:tab w:val="num" w:pos="4320"/>
+        </w:tabs>
+        <w:ind w:left="4320" w:hanging="360"/>
+      </w:pPr>
+    </w:lvl>
+    <w:lvl w:ilvl="6" w:tentative="1">
+      <w:start w:val="1"/>
+      <w:numFmt w:val="decimal"/>
+      <w:lvlText w:val="%7."/>
+      <w:lvlJc w:val="left"/>
+      <w:pPr>
+        <w:tabs>
+          <w:tab w:val="num" w:pos="5040"/>
+        </w:tabs>
+        <w:ind w:left="5040" w:hanging="360"/>
+      </w:pPr>
+    </w:lvl>
+    <w:lvl w:ilvl="7" w:tentative="1">
+      <w:start w:val="1"/>
+      <w:numFmt w:val="decimal"/>
+      <w:lvlText w:val="%8."/>
+      <w:lvlJc w:val="left"/>
+      <w:pPr>
+        <w:tabs>
+          <w:tab w:val="num" w:pos="5760"/>
+        </w:tabs>
+        <w:ind w:left="5760" w:hanging="360"/>
+      </w:pPr>
+    </w:lvl>
+    <w:lvl w:ilvl="8" w:tentative="1">
+      <w:start w:val="1"/>
+      <w:numFmt w:val="decimal"/>
+      <w:lvlText w:val="%9."/>
+      <w:lvlJc w:val="left"/>
+      <w:pPr>
+        <w:tabs>
+          <w:tab w:val="num" w:pos="6480"/>
+        </w:tabs>
+        <w:ind w:left="6480" w:hanging="360"/>
+      </w:pPr>
+    </w:lvl>
+  </w:abstractNum>
+  <w:num w:numId="1" w16cid:durableId="1479227126">
+    <w:abstractNumId w:val="0"/>
+  </w:num>
+</w:numbering>
+</file>
+
 <file path=word/styles.xml><?xml version="1.0" encoding="utf-8"?>
-<w:styles xmlns:wp14="http://schemas.microsoft.com/office/word/2010/wordprocessingDrawing" xmlns:mc="http://schemas.openxmlformats.org/markup-compatibility/2006" xmlns:r="http://schemas.openxmlformats.org/officeDocument/2006/relationships" xmlns:w="http://schemas.openxmlformats.org/wordprocessingml/2006/main" xmlns:w14="http://schemas.microsoft.com/office/word/2010/wordml" xmlns:w15="http://schemas.microsoft.com/office/word/2012/wordml" xmlns:w16se="http://schemas.microsoft.com/office/word/2015/wordml/symex" xmlns:w16cid="http://schemas.microsoft.com/office/word/2016/wordml/cid" xmlns:w16="http://schemas.microsoft.com/office/word/2018/wordml" xmlns:w16cex="http://schemas.microsoft.com/office/word/2018/wordml/cex" xmlns:w16sdtdh="http://schemas.microsoft.com/office/word/2020/wordml/sdtdatahash" xmlns:w16sdtfl="http://schemas.microsoft.com/office/word/2024/wordml/sdtformatlock" mc:Ignorable="w14 w15 wp14 w16se w16cid w16 w16cex w16sdtdh w16sdtfl">
+<w:styles xmlns:mc="http://schemas.openxmlformats.org/markup-compatibility/2006" xmlns:r="http://schemas.openxmlformats.org/officeDocument/2006/relationships" xmlns:w="http://schemas.openxmlformats.org/wordprocessingml/2006/main" xmlns:w14="http://schemas.microsoft.com/office/word/2010/wordml" xmlns:w15="http://schemas.microsoft.com/office/word/2012/wordml" xmlns:w16cex="http://schemas.microsoft.com/office/word/2018/wordml/cex" xmlns:w16cid="http://schemas.microsoft.com/office/word/2016/wordml/cid" xmlns:w16="http://schemas.microsoft.com/office/word/2018/wordml" xmlns:w16du="http://schemas.microsoft.com/office/word/2023/wordml/word16du" xmlns:w16sdtdh="http://schemas.microsoft.com/office/word/2020/wordml/sdtdatahash" xmlns:w16sdtfl="http://schemas.microsoft.com/office/word/2024/wordml/sdtformatlock" xmlns:w16se="http://schemas.microsoft.com/office/word/2015/wordml/symex" mc:Ignorable="w14 w15 w16se w16cid w16 w16cex w16sdtdh w16sdtfl w16du">
   <w:docDefaults>
     <w:rPrDefault>
       <w:rPr>
-        <w:rFonts w:asciiTheme="minorHAnsi" w:hAnsiTheme="minorHAnsi" w:eastAsiaTheme="minorEastAsia" w:cstheme="minorBidi"/>
+        <w:rFonts w:asciiTheme="minorHAnsi" w:eastAsiaTheme="minorEastAsia" w:hAnsiTheme="minorHAnsi" w:cstheme="minorBidi"/>
         <w:sz w:val="24"/>
         <w:szCs w:val="24"/>
         <w:lang w:val="en-US" w:eastAsia="ja-JP" w:bidi="ar-SA"/>
@@ -294,17 +689,17 @@
       </w:pPr>
     </w:pPrDefault>
   </w:docDefaults>
-  <w:latentStyles w:defLockedState="0" w:defUIPriority="99" w:defSemiHidden="0" w:defUnhideWhenUsed="0" w:defQFormat="0" w:count="371">
+  <w:latentStyles w:defLockedState="0" w:defUIPriority="99" w:defSemiHidden="0" w:defUnhideWhenUsed="0" w:defQFormat="0" w:count="376">
     <w:lsdException w:name="Normal" w:uiPriority="0" w:qFormat="1"/>
     <w:lsdException w:name="heading 1" w:uiPriority="9" w:qFormat="1"/>
-    <w:lsdException w:name="heading 2" w:uiPriority="9" w:semiHidden="1" w:unhideWhenUsed="1" w:qFormat="1"/>
-    <w:lsdException w:name="heading 3" w:uiPriority="9" w:semiHidden="1" w:unhideWhenUsed="1" w:qFormat="1"/>
-    <w:lsdException w:name="heading 4" w:uiPriority="9" w:semiHidden="1" w:unhideWhenUsed="1" w:qFormat="1"/>
-    <w:lsdException w:name="heading 5" w:uiPriority="9" w:semiHidden="1" w:unhideWhenUsed="1" w:qFormat="1"/>
-    <w:lsdException w:name="heading 6" w:uiPriority="9" w:semiHidden="1" w:unhideWhenUsed="1" w:qFormat="1"/>
-    <w:lsdException w:name="heading 7" w:uiPriority="9" w:semiHidden="1" w:unhideWhenUsed="1" w:qFormat="1"/>
-    <w:lsdException w:name="heading 8" w:uiPriority="9" w:semiHidden="1" w:unhideWhenUsed="1" w:qFormat="1"/>
-    <w:lsdException w:name="heading 9" w:uiPriority="9" w:semiHidden="1" w:unhideWhenUsed="1" w:qFormat="1"/>
+    <w:lsdException w:name="heading 2" w:semiHidden="1" w:uiPriority="9" w:unhideWhenUsed="1" w:qFormat="1"/>
+    <w:lsdException w:name="heading 3" w:semiHidden="1" w:uiPriority="9" w:unhideWhenUsed="1" w:qFormat="1"/>
+    <w:lsdException w:name="heading 4" w:semiHidden="1" w:uiPriority="9" w:unhideWhenUsed="1" w:qFormat="1"/>
+    <w:lsdException w:name="heading 5" w:semiHidden="1" w:uiPriority="9" w:unhideWhenUsed="1" w:qFormat="1"/>
+    <w:lsdException w:name="heading 6" w:semiHidden="1" w:uiPriority="9" w:unhideWhenUsed="1" w:qFormat="1"/>
+    <w:lsdException w:name="heading 7" w:semiHidden="1" w:uiPriority="9" w:unhideWhenUsed="1" w:qFormat="1"/>
+    <w:lsdException w:name="heading 8" w:semiHidden="1" w:uiPriority="9" w:unhideWhenUsed="1" w:qFormat="1"/>
+    <w:lsdException w:name="heading 9" w:semiHidden="1" w:uiPriority="9" w:unhideWhenUsed="1" w:qFormat="1"/>
     <w:lsdException w:name="index 1" w:semiHidden="1" w:unhideWhenUsed="1"/>
     <w:lsdException w:name="index 2" w:semiHidden="1" w:unhideWhenUsed="1"/>
     <w:lsdException w:name="index 3" w:semiHidden="1" w:unhideWhenUsed="1"/>
@@ -314,22 +709,22 @@
     <w:lsdException w:name="index 7" w:semiHidden="1" w:unhideWhenUsed="1"/>
     <w:lsdException w:name="index 8" w:semiHidden="1" w:unhideWhenUsed="1"/>
     <w:lsdException w:name="index 9" w:semiHidden="1" w:unhideWhenUsed="1"/>
-    <w:lsdException w:name="toc 1" w:uiPriority="39" w:semiHidden="1" w:unhideWhenUsed="1"/>
-    <w:lsdException w:name="toc 2" w:uiPriority="39" w:semiHidden="1" w:unhideWhenUsed="1"/>
-    <w:lsdException w:name="toc 3" w:uiPriority="39" w:semiHidden="1" w:unhideWhenUsed="1"/>
-    <w:lsdException w:name="toc 4" w:uiPriority="39" w:semiHidden="1" w:unhideWhenUsed="1"/>
-    <w:lsdException w:name="toc 5" w:uiPriority="39" w:semiHidden="1" w:unhideWhenUsed="1"/>
-    <w:lsdException w:name="toc 6" w:uiPriority="39" w:semiHidden="1" w:unhideWhenUsed="1"/>
-    <w:lsdException w:name="toc 7" w:uiPriority="39" w:semiHidden="1" w:unhideWhenUsed="1"/>
-    <w:lsdException w:name="toc 8" w:uiPriority="39" w:semiHidden="1" w:unhideWhenUsed="1"/>
-    <w:lsdException w:name="toc 9" w:uiPriority="39" w:semiHidden="1" w:unhideWhenUsed="1"/>
+    <w:lsdException w:name="toc 1" w:semiHidden="1" w:uiPriority="39" w:unhideWhenUsed="1"/>
+    <w:lsdException w:name="toc 2" w:semiHidden="1" w:uiPriority="39" w:unhideWhenUsed="1"/>
+    <w:lsdException w:name="toc 3" w:semiHidden="1" w:uiPriority="39" w:unhideWhenUsed="1"/>
+    <w:lsdException w:name="toc 4" w:semiHidden="1" w:uiPriority="39" w:unhideWhenUsed="1"/>
+    <w:lsdException w:name="toc 5" w:semiHidden="1" w:uiPriority="39" w:unhideWhenUsed="1"/>
+    <w:lsdException w:name="toc 6" w:semiHidden="1" w:uiPriority="39" w:unhideWhenUsed="1"/>
+    <w:lsdException w:name="toc 7" w:semiHidden="1" w:uiPriority="39" w:unhideWhenUsed="1"/>
+    <w:lsdException w:name="toc 8" w:semiHidden="1" w:uiPriority="39" w:unhideWhenUsed="1"/>
+    <w:lsdException w:name="toc 9" w:semiHidden="1" w:uiPriority="39" w:unhideWhenUsed="1"/>
     <w:lsdException w:name="Normal Indent" w:semiHidden="1" w:unhideWhenUsed="1"/>
     <w:lsdException w:name="footnote text" w:semiHidden="1" w:unhideWhenUsed="1"/>
     <w:lsdException w:name="annotation text" w:semiHidden="1" w:unhideWhenUsed="1"/>
     <w:lsdException w:name="header" w:semiHidden="1" w:unhideWhenUsed="1"/>
     <w:lsdException w:name="footer" w:semiHidden="1" w:unhideWhenUsed="1"/>
     <w:lsdException w:name="index heading" w:semiHidden="1" w:unhideWhenUsed="1"/>
-    <w:lsdException w:name="caption" w:uiPriority="35" w:semiHidden="1" w:unhideWhenUsed="1" w:qFormat="1"/>
+    <w:lsdException w:name="caption" w:semiHidden="1" w:uiPriority="35" w:unhideWhenUsed="1" w:qFormat="1"/>
     <w:lsdException w:name="table of figures" w:semiHidden="1" w:unhideWhenUsed="1"/>
     <w:lsdException w:name="envelope address" w:semiHidden="1" w:unhideWhenUsed="1"/>
     <w:lsdException w:name="envelope return" w:semiHidden="1" w:unhideWhenUsed="1"/>
@@ -360,7 +755,7 @@
     <w:lsdException w:name="Title" w:uiPriority="10" w:qFormat="1"/>
     <w:lsdException w:name="Closing" w:semiHidden="1" w:unhideWhenUsed="1"/>
     <w:lsdException w:name="Signature" w:semiHidden="1" w:unhideWhenUsed="1"/>
-    <w:lsdException w:name="Default Paragraph Font" w:uiPriority="1" w:semiHidden="1" w:unhideWhenUsed="1"/>
+    <w:lsdException w:name="Default Paragraph Font" w:semiHidden="1" w:uiPriority="1" w:unhideWhenUsed="1"/>
     <w:lsdException w:name="Body Text" w:semiHidden="1" w:unhideWhenUsed="1"/>
     <w:lsdException w:name="Body Text Indent" w:semiHidden="1" w:unhideWhenUsed="1"/>
     <w:lsdException w:name="List Continue" w:semiHidden="1" w:unhideWhenUsed="1"/>
@@ -560,8 +955,8 @@
     <w:lsdException w:name="Subtle Reference" w:uiPriority="31" w:qFormat="1"/>
     <w:lsdException w:name="Intense Reference" w:uiPriority="32" w:qFormat="1"/>
     <w:lsdException w:name="Book Title" w:uiPriority="33" w:qFormat="1"/>
-    <w:lsdException w:name="Bibliography" w:uiPriority="37" w:semiHidden="1" w:unhideWhenUsed="1"/>
-    <w:lsdException w:name="TOC Heading" w:uiPriority="39" w:semiHidden="1" w:unhideWhenUsed="1" w:qFormat="1"/>
+    <w:lsdException w:name="Bibliography" w:semiHidden="1" w:uiPriority="37" w:unhideWhenUsed="1"/>
+    <w:lsdException w:name="TOC Heading" w:semiHidden="1" w:uiPriority="39" w:unhideWhenUsed="1" w:qFormat="1"/>
     <w:lsdException w:name="Plain Table 1" w:uiPriority="41"/>
     <w:lsdException w:name="Plain Table 2" w:uiPriority="42"/>
     <w:lsdException w:name="Plain Table 3" w:uiPriority="43"/>
@@ -666,18 +1061,63 @@
     <w:lsdException w:name="List Table 5 Dark Accent 6" w:uiPriority="50"/>
     <w:lsdException w:name="List Table 6 Colorful Accent 6" w:uiPriority="51"/>
     <w:lsdException w:name="List Table 7 Colorful Accent 6" w:uiPriority="52"/>
+    <w:lsdException w:name="Mention" w:semiHidden="1" w:unhideWhenUsed="1"/>
+    <w:lsdException w:name="Smart Hyperlink" w:semiHidden="1" w:unhideWhenUsed="1"/>
+    <w:lsdException w:name="Hashtag" w:semiHidden="1" w:unhideWhenUsed="1"/>
+    <w:lsdException w:name="Unresolved Mention" w:semiHidden="1" w:unhideWhenUsed="1"/>
+    <w:lsdException w:name="Smart Link" w:semiHidden="1" w:unhideWhenUsed="1"/>
   </w:latentStyles>
-  <w:style w:type="paragraph" w:styleId="Normal" w:default="1">
+  <w:style w:type="paragraph" w:default="1" w:styleId="Normal">
     <w:name w:val="Normal"/>
     <w:qFormat/>
   </w:style>
-  <w:style w:type="character" w:styleId="DefaultParagraphFont" w:default="1">
+  <w:style w:type="paragraph" w:styleId="Heading1">
+    <w:name w:val="heading 1"/>
+    <w:basedOn w:val="Normal"/>
+    <w:next w:val="Normal"/>
+    <w:uiPriority w:val="9"/>
+    <w:qFormat/>
+    <w:rsid w:val="20787B03"/>
+    <w:pPr>
+      <w:keepNext/>
+      <w:keepLines/>
+      <w:spacing w:before="360" w:after="80"/>
+      <w:outlineLvl w:val="0"/>
+    </w:pPr>
+    <w:rPr>
+      <w:rFonts w:asciiTheme="majorHAnsi" w:eastAsiaTheme="majorEastAsia" w:hAnsiTheme="majorHAnsi" w:cstheme="majorBidi"/>
+      <w:color w:val="0F4761" w:themeColor="accent1" w:themeShade="BF"/>
+      <w:sz w:val="40"/>
+      <w:szCs w:val="40"/>
+    </w:rPr>
+  </w:style>
+  <w:style w:type="paragraph" w:styleId="Heading3">
+    <w:name w:val="heading 3"/>
+    <w:basedOn w:val="Normal"/>
+    <w:next w:val="Normal"/>
+    <w:uiPriority w:val="9"/>
+    <w:unhideWhenUsed/>
+    <w:qFormat/>
+    <w:rsid w:val="20787B03"/>
+    <w:pPr>
+      <w:keepNext/>
+      <w:keepLines/>
+      <w:spacing w:before="160" w:after="80"/>
+      <w:outlineLvl w:val="2"/>
+    </w:pPr>
+    <w:rPr>
+      <w:rFonts w:eastAsiaTheme="majorEastAsia" w:cstheme="majorBidi"/>
+      <w:color w:val="0F4761" w:themeColor="accent1" w:themeShade="BF"/>
+      <w:sz w:val="28"/>
+      <w:szCs w:val="28"/>
+    </w:rPr>
+  </w:style>
+  <w:style w:type="character" w:default="1" w:styleId="DefaultParagraphFont">
     <w:name w:val="Default Paragraph Font"/>
     <w:uiPriority w:val="1"/>
-    <w:semiHidden/>
     <w:unhideWhenUsed/>
   </w:style>
-  <w:style w:type="table" w:styleId="TableNormal" w:default="1">
+  <w:style w:type="table" w:default="1" w:styleId="TableNormal">
     <w:name w:val="Normal Table"/>
     <w:uiPriority w:val="99"/>
     <w:semiHidden/>
@@ -692,58 +1132,17 @@
       </w:tblCellMar>
     </w:tblPr>
   </w:style>
-  <w:style w:type="numbering" w:styleId="NoList" w:default="1">
+  <w:style w:type="numbering" w:default="1" w:styleId="NoList">
     <w:name w:val="No List"/>
     <w:uiPriority w:val="99"/>
     <w:semiHidden/>
     <w:unhideWhenUsed/>
   </w:style>
-  <w:style w:type="paragraph" w:styleId="Heading1">
-    <w:uiPriority w:val="9"/>
-    <w:name w:val="heading 1"/>
-    <w:basedOn w:val="Normal"/>
-    <w:next w:val="Normal"/>
-    <w:qFormat/>
-    <w:rsid w:val="20787B03"/>
-    <w:rPr>
-      <w:rFonts w:ascii="Aptos Display" w:hAnsi="Aptos Display" w:eastAsia="" w:cs="" w:asciiTheme="majorAscii" w:hAnsiTheme="majorAscii" w:eastAsiaTheme="majorEastAsia" w:cstheme="majorBidi"/>
-      <w:color w:val="0F4761" w:themeColor="accent1" w:themeTint="FF" w:themeShade="BF"/>
-      <w:sz w:val="40"/>
-      <w:szCs w:val="40"/>
-    </w:rPr>
-    <w:pPr>
-      <w:keepNext w:val="1"/>
-      <w:keepLines w:val="1"/>
-      <w:spacing w:before="360" w:after="80"/>
-      <w:outlineLvl w:val="0"/>
-    </w:pPr>
-  </w:style>
-  <w:style w:type="paragraph" w:styleId="Heading3">
-    <w:uiPriority w:val="9"/>
-    <w:name w:val="heading 3"/>
-    <w:basedOn w:val="Normal"/>
-    <w:next w:val="Normal"/>
-    <w:unhideWhenUsed/>
-    <w:qFormat/>
-    <w:rsid w:val="20787B03"/>
-    <w:rPr>
-      <w:rFonts w:eastAsia="" w:cs="" w:eastAsiaTheme="majorEastAsia" w:cstheme="majorBidi"/>
-      <w:color w:val="0F4761" w:themeColor="accent1" w:themeTint="FF" w:themeShade="BF"/>
-      <w:sz w:val="28"/>
-      <w:szCs w:val="28"/>
-    </w:rPr>
-    <w:pPr>
-      <w:keepNext w:val="1"/>
-      <w:keepLines w:val="1"/>
-      <w:spacing w:before="160" w:after="80"/>
-      <w:outlineLvl w:val="2"/>
-    </w:pPr>
-  </w:style>
 </w:styles>
 </file>
 
 <file path=word/theme/theme1.xml><?xml version="1.0" encoding="utf-8"?>
-<a:theme xmlns:thm15="http://schemas.microsoft.com/office/thememl/2012/main" xmlns:a="http://schemas.openxmlformats.org/drawingml/2006/main" name="Office Theme">
+<a:theme xmlns:a="http://schemas.openxmlformats.org/drawingml/2006/main" name="Office Theme">
   <a:themeElements>
     <a:clrScheme name="Office">
       <a:dk1>

</xml_diff>